<commit_message>
Completed Code with corrections
</commit_message>
<xml_diff>
--- a/COMscDS252P-011 Data Mining CW.docx
+++ b/COMscDS252P-011 Data Mining CW.docx
@@ -4958,7 +4958,7 @@
                 <w:noProof/>
                 <w:webHidden/>
               </w:rPr>
-              <w:t>7</w:t>
+              <w:t>6</w:t>
             </w:r>
             <w:r>
               <w:rPr>
@@ -5165,7 +5165,7 @@
                 <w:noProof/>
                 <w:webHidden/>
               </w:rPr>
-              <w:t>8</w:t>
+              <w:t>7</w:t>
             </w:r>
             <w:r>
               <w:rPr>
@@ -5303,7 +5303,7 @@
                 <w:noProof/>
                 <w:webHidden/>
               </w:rPr>
-              <w:t>10</w:t>
+              <w:t>9</w:t>
             </w:r>
             <w:r>
               <w:rPr>
@@ -5372,7 +5372,7 @@
                 <w:noProof/>
                 <w:webHidden/>
               </w:rPr>
-              <w:t>11</w:t>
+              <w:t>9</w:t>
             </w:r>
             <w:r>
               <w:rPr>
@@ -5442,7 +5442,7 @@
                 <w:noProof/>
                 <w:webHidden/>
               </w:rPr>
-              <w:t>13</w:t>
+              <w:t>11</w:t>
             </w:r>
             <w:r>
               <w:rPr>
@@ -5511,7 +5511,7 @@
                 <w:noProof/>
                 <w:webHidden/>
               </w:rPr>
-              <w:t>13</w:t>
+              <w:t>11</w:t>
             </w:r>
             <w:r>
               <w:rPr>
@@ -5580,7 +5580,7 @@
                 <w:noProof/>
                 <w:webHidden/>
               </w:rPr>
-              <w:t>13</w:t>
+              <w:t>11</w:t>
             </w:r>
             <w:r>
               <w:rPr>
@@ -5649,7 +5649,7 @@
                 <w:noProof/>
                 <w:webHidden/>
               </w:rPr>
-              <w:t>13</w:t>
+              <w:t>11</w:t>
             </w:r>
             <w:r>
               <w:rPr>
@@ -5718,7 +5718,7 @@
                 <w:noProof/>
                 <w:webHidden/>
               </w:rPr>
-              <w:t>14</w:t>
+              <w:t>12</w:t>
             </w:r>
             <w:r>
               <w:rPr>
@@ -5787,7 +5787,7 @@
                 <w:noProof/>
                 <w:webHidden/>
               </w:rPr>
-              <w:t>14</w:t>
+              <w:t>12</w:t>
             </w:r>
             <w:r>
               <w:rPr>
@@ -5856,7 +5856,7 @@
                 <w:noProof/>
                 <w:webHidden/>
               </w:rPr>
-              <w:t>15</w:t>
+              <w:t>13</w:t>
             </w:r>
             <w:r>
               <w:rPr>
@@ -5925,7 +5925,7 @@
                 <w:noProof/>
                 <w:webHidden/>
               </w:rPr>
-              <w:t>15</w:t>
+              <w:t>13</w:t>
             </w:r>
             <w:r>
               <w:rPr>
@@ -5994,7 +5994,7 @@
                 <w:noProof/>
                 <w:webHidden/>
               </w:rPr>
-              <w:t>16</w:t>
+              <w:t>14</w:t>
             </w:r>
             <w:r>
               <w:rPr>
@@ -6063,7 +6063,7 @@
                 <w:noProof/>
                 <w:webHidden/>
               </w:rPr>
-              <w:t>16</w:t>
+              <w:t>14</w:t>
             </w:r>
             <w:r>
               <w:rPr>
@@ -6132,7 +6132,7 @@
                 <w:noProof/>
                 <w:webHidden/>
               </w:rPr>
-              <w:t>16</w:t>
+              <w:t>14</w:t>
             </w:r>
             <w:r>
               <w:rPr>
@@ -6201,7 +6201,7 @@
                 <w:noProof/>
                 <w:webHidden/>
               </w:rPr>
-              <w:t>17</w:t>
+              <w:t>15</w:t>
             </w:r>
             <w:r>
               <w:rPr>
@@ -6270,7 +6270,7 @@
                 <w:noProof/>
                 <w:webHidden/>
               </w:rPr>
-              <w:t>18</w:t>
+              <w:t>16</w:t>
             </w:r>
             <w:r>
               <w:rPr>
@@ -6339,7 +6339,7 @@
                 <w:noProof/>
                 <w:webHidden/>
               </w:rPr>
-              <w:t>18</w:t>
+              <w:t>17</w:t>
             </w:r>
             <w:r>
               <w:rPr>
@@ -6408,7 +6408,7 @@
                 <w:noProof/>
                 <w:webHidden/>
               </w:rPr>
-              <w:t>19</w:t>
+              <w:t>17</w:t>
             </w:r>
             <w:r>
               <w:rPr>
@@ -6477,7 +6477,7 @@
                 <w:noProof/>
                 <w:webHidden/>
               </w:rPr>
-              <w:t>19</w:t>
+              <w:t>17</w:t>
             </w:r>
             <w:r>
               <w:rPr>
@@ -6546,7 +6546,7 @@
                 <w:noProof/>
                 <w:webHidden/>
               </w:rPr>
-              <w:t>20</w:t>
+              <w:t>18</w:t>
             </w:r>
             <w:r>
               <w:rPr>
@@ -6615,7 +6615,7 @@
                 <w:noProof/>
                 <w:webHidden/>
               </w:rPr>
-              <w:t>20</w:t>
+              <w:t>18</w:t>
             </w:r>
             <w:r>
               <w:rPr>
@@ -6684,7 +6684,7 @@
                 <w:noProof/>
                 <w:webHidden/>
               </w:rPr>
-              <w:t>20</w:t>
+              <w:t>19</w:t>
             </w:r>
             <w:r>
               <w:rPr>
@@ -6753,7 +6753,7 @@
                 <w:noProof/>
                 <w:webHidden/>
               </w:rPr>
-              <w:t>21</w:t>
+              <w:t>19</w:t>
             </w:r>
             <w:r>
               <w:rPr>
@@ -6822,7 +6822,7 @@
                 <w:noProof/>
                 <w:webHidden/>
               </w:rPr>
-              <w:t>22</w:t>
+              <w:t>20</w:t>
             </w:r>
             <w:r>
               <w:rPr>
@@ -6891,7 +6891,7 @@
                 <w:noProof/>
                 <w:webHidden/>
               </w:rPr>
-              <w:t>23</w:t>
+              <w:t>21</w:t>
             </w:r>
             <w:r>
               <w:rPr>
@@ -6960,7 +6960,7 @@
                 <w:noProof/>
                 <w:webHidden/>
               </w:rPr>
-              <w:t>23</w:t>
+              <w:t>21</w:t>
             </w:r>
             <w:r>
               <w:rPr>
@@ -7029,7 +7029,7 @@
                 <w:noProof/>
                 <w:webHidden/>
               </w:rPr>
-              <w:t>24</w:t>
+              <w:t>22</w:t>
             </w:r>
             <w:r>
               <w:rPr>
@@ -19655,7 +19655,7 @@
 </file>
 
 <file path=customXml/itemProps1.xml><?xml version="1.0" encoding="utf-8"?>
-<ds:datastoreItem xmlns:ds="http://schemas.openxmlformats.org/officeDocument/2006/customXml" ds:itemID="{AB2E7675-D8C7-44EE-80D6-5705568DF391}">
+<ds:datastoreItem xmlns:ds="http://schemas.openxmlformats.org/officeDocument/2006/customXml" ds:itemID="{6E8B0B1E-70D5-442A-9AAD-536D657CB582}">
   <ds:schemaRefs>
     <ds:schemaRef ds:uri="http://schemas.openxmlformats.org/officeDocument/2006/bibliography"/>
   </ds:schemaRefs>

</xml_diff>